<commit_message>
Dopisz obsługę leadów i umawianie prezentacji do podsumowania usług
Co-Authored-By: Claude Opus 5.5 <noreply@anthropic.com>
Claude-Session: https://claude.ai/code/session_019y51daMZffDwdD1p2RgJhu
</commit_message>
<xml_diff>
--- a/Kaszubska_Osada_podsumowanie_uslug.docx
+++ b/Kaszubska_Osada_podsumowanie_uslug.docx
@@ -46,7 +46,7 @@
           <w:sz w:val="21"/>
           <w:szCs w:val="21"/>
         </w:rPr>
-        <w:t xml:space="preserve">Strona sprzedażowa · automatyzacja leadów · analityka · kampanie Meta i Google · bieżąca obsługa</w:t>
+        <w:t xml:space="preserve">Strona sprzedażowa · automatyzacja leadów · analityka · kampanie Meta i Google · obsługa klientów</w:t>
       </w:r>
     </w:p>
     <w:p>
@@ -60,7 +60,7 @@
           <w:sz w:val="22"/>
           <w:szCs w:val="22"/>
         </w:rPr>
-        <w:t xml:space="preserve">Zbudowałem kompletny system sprzedaży online dla inwestycji Kaszubska Osada: od projektu strony, przez automatyczne zbieranie zapytań, po prowadzenie i optymalizację kampanii reklamowych. Wszystkie elementy są ze sobą połączone i działają bez przerwy.</w:t>
+        <w:t xml:space="preserve">Zbudowałem kompletny system sprzedaży online dla inwestycji Kaszubska Osada: od projektu strony, przez automatyczne zbieranie zapytań, po prowadzenie kampanii reklamowych i telefoniczną obsługę leadów aż do umówienia prezentacji na miejscu. Wszystkie elementy są ze sobą połączone i działają bez przerwy.</w:t>
       </w:r>
     </w:p>
     <w:p>
@@ -1629,6 +1629,173 @@
           <w:sz w:val="28"/>
           <w:szCs w:val="28"/>
         </w:rPr>
+        <w:t xml:space="preserve">Obsługa leadów i wsparcie sprzedaży</w:t>
+      </w:r>
+    </w:p>
+    <w:p>
+      <w:pPr>
+        <w:spacing w:after="100"/>
+      </w:pPr>
+      <w:r>
+        <w:rPr>
+          <w:rFonts w:ascii="Calibri" w:cs="Calibri" w:eastAsia="Calibri" w:hAnsi="Calibri"/>
+          <w:i/>
+          <w:iCs/>
+          <w:color w:val="5A6B60"/>
+          <w:sz w:val="21"/>
+          <w:szCs w:val="21"/>
+        </w:rPr>
+        <w:t xml:space="preserve">Leady nie zostawały same sobie – każdy był prowadzony aż do spotkania.</w:t>
+      </w:r>
+    </w:p>
+    <w:p>
+      <w:pPr>
+        <w:pStyle w:val="ListParagraph"/>
+        <w:numPr>
+          <w:ilvl w:val="0"/>
+          <w:numId w:val="2"/>
+        </w:numPr>
+        <w:spacing w:after="70"/>
+      </w:pPr>
+      <w:r>
+        <w:rPr>
+          <w:rFonts w:ascii="Calibri" w:cs="Calibri" w:eastAsia="Calibri" w:hAnsi="Calibri"/>
+          <w:b/>
+          <w:bCs/>
+          <w:color w:val="1A3A2A"/>
+          <w:sz w:val="21"/>
+          <w:szCs w:val="21"/>
+        </w:rPr>
+        <w:t xml:space="preserve">Szybki kontakt telefoniczny</w:t>
+      </w:r>
+      <w:r>
+        <w:rPr>
+          <w:rFonts w:ascii="Calibri" w:cs="Calibri" w:eastAsia="Calibri" w:hAnsi="Calibri"/>
+          <w:color w:val="333333"/>
+          <w:sz w:val="21"/>
+          <w:szCs w:val="21"/>
+        </w:rPr>
+        <w:t xml:space="preserve"> – dzwonienie do każdej osoby, która zostawiła zgłoszenie</w:t>
+      </w:r>
+    </w:p>
+    <w:p>
+      <w:pPr>
+        <w:pStyle w:val="ListParagraph"/>
+        <w:numPr>
+          <w:ilvl w:val="0"/>
+          <w:numId w:val="2"/>
+        </w:numPr>
+        <w:spacing w:after="70"/>
+      </w:pPr>
+      <w:r>
+        <w:rPr>
+          <w:rFonts w:ascii="Calibri" w:cs="Calibri" w:eastAsia="Calibri" w:hAnsi="Calibri"/>
+          <w:b/>
+          <w:bCs/>
+          <w:color w:val="1A3A2A"/>
+          <w:sz w:val="21"/>
+          <w:szCs w:val="21"/>
+        </w:rPr>
+        <w:t xml:space="preserve">Systematyczny follow-up</w:t>
+      </w:r>
+      <w:r>
+        <w:rPr>
+          <w:rFonts w:ascii="Calibri" w:cs="Calibri" w:eastAsia="Calibri" w:hAnsi="Calibri"/>
+          <w:color w:val="333333"/>
+          <w:sz w:val="21"/>
+          <w:szCs w:val="21"/>
+        </w:rPr>
+        <w:t xml:space="preserve"> – ponowny kontakt z osobami, które nie odebrały lub potrzebowały czasu</w:t>
+      </w:r>
+    </w:p>
+    <w:p>
+      <w:pPr>
+        <w:pStyle w:val="ListParagraph"/>
+        <w:numPr>
+          <w:ilvl w:val="0"/>
+          <w:numId w:val="2"/>
+        </w:numPr>
+        <w:spacing w:after="70"/>
+      </w:pPr>
+      <w:r>
+        <w:rPr>
+          <w:rFonts w:ascii="Calibri" w:cs="Calibri" w:eastAsia="Calibri" w:hAnsi="Calibri"/>
+          <w:b/>
+          <w:bCs/>
+          <w:color w:val="1A3A2A"/>
+          <w:sz w:val="21"/>
+          <w:szCs w:val="21"/>
+        </w:rPr>
+        <w:t xml:space="preserve">Kwalifikacja klientów</w:t>
+      </w:r>
+      <w:r>
+        <w:rPr>
+          <w:rFonts w:ascii="Calibri" w:cs="Calibri" w:eastAsia="Calibri" w:hAnsi="Calibri"/>
+          <w:color w:val="333333"/>
+          <w:sz w:val="21"/>
+          <w:szCs w:val="21"/>
+        </w:rPr>
+        <w:t xml:space="preserve"> – rozpoznanie potrzeb, budżetu i poziomu zainteresowania</w:t>
+      </w:r>
+    </w:p>
+    <w:p>
+      <w:pPr>
+        <w:pStyle w:val="ListParagraph"/>
+        <w:numPr>
+          <w:ilvl w:val="0"/>
+          <w:numId w:val="2"/>
+        </w:numPr>
+        <w:spacing w:after="70"/>
+      </w:pPr>
+      <w:r>
+        <w:rPr>
+          <w:rFonts w:ascii="Calibri" w:cs="Calibri" w:eastAsia="Calibri" w:hAnsi="Calibri"/>
+          <w:b/>
+          <w:bCs/>
+          <w:color w:val="1A3A2A"/>
+          <w:sz w:val="21"/>
+          <w:szCs w:val="21"/>
+        </w:rPr>
+        <w:t xml:space="preserve">Umawianie prezentacji na miejscu inwestycji</w:t>
+      </w:r>
+      <w:r>
+        <w:rPr>
+          <w:rFonts w:ascii="Calibri" w:cs="Calibri" w:eastAsia="Calibri" w:hAnsi="Calibri"/>
+          <w:color w:val="333333"/>
+          <w:sz w:val="21"/>
+          <w:szCs w:val="21"/>
+        </w:rPr>
+        <w:t xml:space="preserve"> – przekazywanie gotowych spotkań z realnie zainteresowanymi klientami</w:t>
+      </w:r>
+    </w:p>
+    <w:p>
+      <w:pPr>
+        <w:pStyle w:val="Heading1"/>
+        <w:pBdr>
+          <w:bottom w:val="single" w:color="B8963A" w:sz="6" w:space="4"/>
+        </w:pBdr>
+        <w:spacing w:after="80" w:before="300"/>
+      </w:pPr>
+      <w:r>
+        <w:rPr>
+          <w:rFonts w:ascii="Calibri" w:cs="Calibri" w:eastAsia="Calibri" w:hAnsi="Calibri"/>
+          <w:b/>
+          <w:bCs/>
+          <w:color w:val="B8963A"/>
+          <w:sz w:val="28"/>
+          <w:szCs w:val="28"/>
+        </w:rPr>
+        <w:t xml:space="preserve">10  </w:t>
+      </w:r>
+      <w:r>
+        <w:rPr>
+          <w:rFonts w:ascii="Calibri" w:cs="Calibri" w:eastAsia="Calibri" w:hAnsi="Calibri"/>
+          <w:b/>
+          <w:bCs/>
+          <w:color w:val="1A3A2A"/>
+          <w:sz w:val="28"/>
+          <w:szCs w:val="28"/>
+        </w:rPr>
         <w:t xml:space="preserve">Bieżąca obsługa i rozwój</w:t>
       </w:r>
     </w:p>
@@ -1744,7 +1911,7 @@
     </w:p>
     <w:tbl>
       <w:tblPr>
-        <w:tblW w:type="dxa" w:w="9025"/>
+        <w:tblW w:type="dxa" w:w="9024"/>
         <w:tblBorders>
           <w:top w:val="single" w:color="auto" w:sz="4"/>
           <w:left w:val="single" w:color="auto" w:sz="4"/>
@@ -1755,16 +1922,17 @@
         </w:tblBorders>
       </w:tblPr>
       <w:tblGrid>
-        <w:gridCol w:w="1805"/>
-        <w:gridCol w:w="1805"/>
-        <w:gridCol w:w="1805"/>
-        <w:gridCol w:w="1805"/>
-        <w:gridCol w:w="1805"/>
+        <w:gridCol w:w="1504"/>
+        <w:gridCol w:w="1504"/>
+        <w:gridCol w:w="1504"/>
+        <w:gridCol w:w="1504"/>
+        <w:gridCol w:w="1504"/>
+        <w:gridCol w:w="1504"/>
       </w:tblGrid>
       <w:tr>
         <w:tc>
           <w:tcPr>
-            <w:tcW w:type="dxa" w:w="1805"/>
+            <w:tcW w:type="dxa" w:w="1504"/>
             <w:tcBorders>
               <w:top w:val="none" w:color="FFFFFF" w:sz="0"/>
               <w:left w:val="none" w:color="FFFFFF" w:sz="0"/>
@@ -1815,7 +1983,7 @@
         </w:tc>
         <w:tc>
           <w:tcPr>
-            <w:tcW w:type="dxa" w:w="1805"/>
+            <w:tcW w:type="dxa" w:w="1504"/>
             <w:tcBorders>
               <w:top w:val="none" w:color="FFFFFF" w:sz="0"/>
               <w:left w:val="none" w:color="FFFFFF" w:sz="0"/>
@@ -1866,7 +2034,7 @@
         </w:tc>
         <w:tc>
           <w:tcPr>
-            <w:tcW w:type="dxa" w:w="1805"/>
+            <w:tcW w:type="dxa" w:w="1504"/>
             <w:tcBorders>
               <w:top w:val="none" w:color="FFFFFF" w:sz="0"/>
               <w:left w:val="none" w:color="FFFFFF" w:sz="0"/>
@@ -1917,7 +2085,7 @@
         </w:tc>
         <w:tc>
           <w:tcPr>
-            <w:tcW w:type="dxa" w:w="1805"/>
+            <w:tcW w:type="dxa" w:w="1504"/>
             <w:tcBorders>
               <w:top w:val="none" w:color="FFFFFF" w:sz="0"/>
               <w:left w:val="none" w:color="FFFFFF" w:sz="0"/>
@@ -1968,7 +2136,7 @@
         </w:tc>
         <w:tc>
           <w:tcPr>
-            <w:tcW w:type="dxa" w:w="1805"/>
+            <w:tcW w:type="dxa" w:w="1504"/>
             <w:tcBorders>
               <w:top w:val="none" w:color="FFFFFF" w:sz="0"/>
               <w:left w:val="none" w:color="FFFFFF" w:sz="0"/>
@@ -1997,7 +2165,7 @@
                 <w:sz w:val="19"/>
                 <w:szCs w:val="19"/>
               </w:rPr>
-              <w:t xml:space="preserve">5. Kontakt</w:t>
+              <w:t xml:space="preserve">5. Telefon</w:t>
             </w:r>
           </w:p>
           <w:p>
@@ -2013,7 +2181,58 @@
                 <w:sz w:val="19"/>
                 <w:szCs w:val="19"/>
               </w:rPr>
-              <w:t xml:space="preserve">handlowy</w:t>
+              <w:t xml:space="preserve">i follow-up</w:t>
+            </w:r>
+          </w:p>
+        </w:tc>
+        <w:tc>
+          <w:tcPr>
+            <w:tcW w:type="dxa" w:w="1504"/>
+            <w:tcBorders>
+              <w:top w:val="none" w:color="FFFFFF" w:sz="0"/>
+              <w:left w:val="none" w:color="FFFFFF" w:sz="0"/>
+              <w:bottom w:val="none" w:color="FFFFFF" w:sz="0"/>
+              <w:right w:val="single" w:color="FFFFFF" w:sz="12"/>
+            </w:tcBorders>
+            <w:shd w:fill="F5F0E8" w:color="auto" w:val="clear"/>
+            <w:tcMar>
+              <w:top w:type="dxa" w:w="120"/>
+              <w:left w:type="dxa" w:w="80"/>
+              <w:bottom w:type="dxa" w:w="120"/>
+              <w:right w:type="dxa" w:w="80"/>
+            </w:tcMar>
+            <w:vAlign w:val="center"/>
+          </w:tcPr>
+          <w:p>
+            <w:pPr>
+              <w:jc w:val="center"/>
+            </w:pPr>
+            <w:r>
+              <w:rPr>
+                <w:rFonts w:ascii="Calibri" w:cs="Calibri" w:eastAsia="Calibri" w:hAnsi="Calibri"/>
+                <w:b/>
+                <w:bCs/>
+                <w:color w:val="1A3A2A"/>
+                <w:sz w:val="19"/>
+                <w:szCs w:val="19"/>
+              </w:rPr>
+              <w:t xml:space="preserve">6. Prezentacja</w:t>
+            </w:r>
+          </w:p>
+          <w:p>
+            <w:pPr>
+              <w:jc w:val="center"/>
+            </w:pPr>
+            <w:r>
+              <w:rPr>
+                <w:rFonts w:ascii="Calibri" w:cs="Calibri" w:eastAsia="Calibri" w:hAnsi="Calibri"/>
+                <w:b w:val="false"/>
+                <w:bCs w:val="false"/>
+                <w:color w:val="1A3A2A"/>
+                <w:sz w:val="19"/>
+                <w:szCs w:val="19"/>
+              </w:rPr>
+              <w:t xml:space="preserve">na miejscu</w:t>
             </w:r>
           </w:p>
         </w:tc>
@@ -2032,7 +2251,7 @@
           <w:sz w:val="21"/>
           <w:szCs w:val="21"/>
         </w:rPr>
-        <w:t xml:space="preserve">Od pierwszego kontaktu z reklamą do rozmowy z klientem – każdy etap jest zautomatyzowany, mierzony i stale ulepszany.</w:t>
+        <w:t xml:space="preserve">Od pierwszego kontaktu z reklamą aż do spotkania z klientem na miejscu inwestycji – każdy etap jest obsłużony, mierzony i stale ulepszany.</w:t>
       </w:r>
     </w:p>
     <w:sectPr>

</xml_diff>

<commit_message>
Uzupełnij podsumowanie usług o karty lokali, wizytówkę Google, Search Console i konwersje
Co-Authored-By: Claude Opus 5.5 <noreply@anthropic.com>
Claude-Session: https://claude.ai/code/session_019y51daMZffDwdD1p2RgJhu
</commit_message>
<xml_diff>
--- a/Kaszubska_Osada_podsumowanie_uslug.docx
+++ b/Kaszubska_Osada_podsumowanie_uslug.docx
@@ -621,16 +621,16 @@
           <w:sz w:val="21"/>
           <w:szCs w:val="21"/>
         </w:rPr>
-        <w:t xml:space="preserve">Karty lokali do pobrania (PDF)</w:t>
-      </w:r>
-      <w:r>
-        <w:rPr>
-          <w:rFonts w:ascii="Calibri" w:cs="Calibri" w:eastAsia="Calibri" w:hAnsi="Calibri"/>
-          <w:color w:val="333333"/>
-          <w:sz w:val="21"/>
-          <w:szCs w:val="21"/>
-        </w:rPr>
-        <w:t xml:space="preserve"> – osobna karta dla każdego domu</w:t>
+        <w:t xml:space="preserve">Projekt kart lokali (PDF)</w:t>
+      </w:r>
+      <w:r>
+        <w:rPr>
+          <w:rFonts w:ascii="Calibri" w:cs="Calibri" w:eastAsia="Calibri" w:hAnsi="Calibri"/>
+          <w:color w:val="333333"/>
+          <w:sz w:val="21"/>
+          <w:szCs w:val="21"/>
+        </w:rPr>
+        <w:t xml:space="preserve"> – autorski projekt karty dla każdego domu, do pobrania ze strony</w:t>
       </w:r>
     </w:p>
     <w:p>
@@ -681,16 +681,16 @@
           <w:sz w:val="21"/>
           <w:szCs w:val="21"/>
         </w:rPr>
-        <w:t xml:space="preserve">Wizualizacje i zdjęcia</w:t>
-      </w:r>
-      <w:r>
-        <w:rPr>
-          <w:rFonts w:ascii="Calibri" w:cs="Calibri" w:eastAsia="Calibri" w:hAnsi="Calibri"/>
-          <w:color w:val="333333"/>
-          <w:sz w:val="21"/>
-          <w:szCs w:val="21"/>
-        </w:rPr>
-        <w:t xml:space="preserve"> – dobór, obróbka i optymalizacja pod szybkie ładowanie</w:t>
+        <w:t xml:space="preserve">Obróbka zdjęć i wizualizacji</w:t>
+      </w:r>
+      <w:r>
+        <w:rPr>
+          <w:rFonts w:ascii="Calibri" w:cs="Calibri" w:eastAsia="Calibri" w:hAnsi="Calibri"/>
+          <w:color w:val="333333"/>
+          <w:sz w:val="21"/>
+          <w:szCs w:val="21"/>
+        </w:rPr>
+        <w:t xml:space="preserve"> – retusz, kadrowanie i optymalizacja pod szybkie ładowanie</w:t>
       </w:r>
     </w:p>
     <w:p>
@@ -909,16 +909,16 @@
           <w:sz w:val="21"/>
           <w:szCs w:val="21"/>
         </w:rPr>
-        <w:t xml:space="preserve">Polityka prywatności</w:t>
-      </w:r>
-      <w:r>
-        <w:rPr>
-          <w:rFonts w:ascii="Calibri" w:cs="Calibri" w:eastAsia="Calibri" w:hAnsi="Calibri"/>
-          <w:color w:val="333333"/>
-          <w:sz w:val="21"/>
-          <w:szCs w:val="21"/>
-        </w:rPr>
-        <w:t xml:space="preserve"> – opracowana i opublikowana na stronie</w:t>
+        <w:t xml:space="preserve">Opracowanie polityki prywatności</w:t>
+      </w:r>
+      <w:r>
+        <w:rPr>
+          <w:rFonts w:ascii="Calibri" w:cs="Calibri" w:eastAsia="Calibri" w:hAnsi="Calibri"/>
+          <w:color w:val="333333"/>
+          <w:sz w:val="21"/>
+          <w:szCs w:val="21"/>
+        </w:rPr>
+        <w:t xml:space="preserve"> – przygotowana od podstaw i opublikowana na stronie</w:t>
       </w:r>
     </w:p>
     <w:p>
@@ -1197,6 +1197,66 @@
           <w:sz w:val="21"/>
           <w:szCs w:val="21"/>
         </w:rPr>
+        <w:t xml:space="preserve">Wizytówka Google (Google Business Profile)</w:t>
+      </w:r>
+      <w:r>
+        <w:rPr>
+          <w:rFonts w:ascii="Calibri" w:cs="Calibri" w:eastAsia="Calibri" w:hAnsi="Calibri"/>
+          <w:color w:val="333333"/>
+          <w:sz w:val="21"/>
+          <w:szCs w:val="21"/>
+        </w:rPr>
+        <w:t xml:space="preserve"> – założenie i konfiguracja – inwestycja widoczna w Mapach Google</w:t>
+      </w:r>
+    </w:p>
+    <w:p>
+      <w:pPr>
+        <w:pStyle w:val="ListParagraph"/>
+        <w:numPr>
+          <w:ilvl w:val="0"/>
+          <w:numId w:val="2"/>
+        </w:numPr>
+        <w:spacing w:after="70"/>
+      </w:pPr>
+      <w:r>
+        <w:rPr>
+          <w:rFonts w:ascii="Calibri" w:cs="Calibri" w:eastAsia="Calibri" w:hAnsi="Calibri"/>
+          <w:b/>
+          <w:bCs/>
+          <w:color w:val="1A3A2A"/>
+          <w:sz w:val="21"/>
+          <w:szCs w:val="21"/>
+        </w:rPr>
+        <w:t xml:space="preserve">Google Search Console</w:t>
+      </w:r>
+      <w:r>
+        <w:rPr>
+          <w:rFonts w:ascii="Calibri" w:cs="Calibri" w:eastAsia="Calibri" w:hAnsi="Calibri"/>
+          <w:color w:val="333333"/>
+          <w:sz w:val="21"/>
+          <w:szCs w:val="21"/>
+        </w:rPr>
+        <w:t xml:space="preserve"> – podłączenie strony i monitorowanie widoczności w wyszukiwarce</w:t>
+      </w:r>
+    </w:p>
+    <w:p>
+      <w:pPr>
+        <w:pStyle w:val="ListParagraph"/>
+        <w:numPr>
+          <w:ilvl w:val="0"/>
+          <w:numId w:val="2"/>
+        </w:numPr>
+        <w:spacing w:after="70"/>
+      </w:pPr>
+      <w:r>
+        <w:rPr>
+          <w:rFonts w:ascii="Calibri" w:cs="Calibri" w:eastAsia="Calibri" w:hAnsi="Calibri"/>
+          <w:b/>
+          <w:bCs/>
+          <w:color w:val="1A3A2A"/>
+          <w:sz w:val="21"/>
+          <w:szCs w:val="21"/>
+        </w:rPr>
         <w:t xml:space="preserve">Optymalizacja pod wyszukiwarki</w:t>
       </w:r>
       <w:r>
@@ -1589,16 +1649,46 @@
           <w:sz w:val="21"/>
           <w:szCs w:val="21"/>
         </w:rPr>
-        <w:t xml:space="preserve">Pomiar konwersji i optymalizacja</w:t>
-      </w:r>
-      <w:r>
-        <w:rPr>
-          <w:rFonts w:ascii="Calibri" w:cs="Calibri" w:eastAsia="Calibri" w:hAnsi="Calibri"/>
-          <w:color w:val="333333"/>
-          <w:sz w:val="21"/>
-          <w:szCs w:val="21"/>
-        </w:rPr>
-        <w:t xml:space="preserve"> – kampania połączona z analityką strony</w:t>
+        <w:t xml:space="preserve">Konfiguracja konwersji</w:t>
+      </w:r>
+      <w:r>
+        <w:rPr>
+          <w:rFonts w:ascii="Calibri" w:cs="Calibri" w:eastAsia="Calibri" w:hAnsi="Calibri"/>
+          <w:color w:val="333333"/>
+          <w:sz w:val="21"/>
+          <w:szCs w:val="21"/>
+        </w:rPr>
+        <w:t xml:space="preserve"> – przez Google Tag Manager – kampania wie, które kliknięcia kończą się zapytaniem</w:t>
+      </w:r>
+    </w:p>
+    <w:p>
+      <w:pPr>
+        <w:pStyle w:val="ListParagraph"/>
+        <w:numPr>
+          <w:ilvl w:val="0"/>
+          <w:numId w:val="2"/>
+        </w:numPr>
+        <w:spacing w:after="70"/>
+      </w:pPr>
+      <w:r>
+        <w:rPr>
+          <w:rFonts w:ascii="Calibri" w:cs="Calibri" w:eastAsia="Calibri" w:hAnsi="Calibri"/>
+          <w:b/>
+          <w:bCs/>
+          <w:color w:val="1A3A2A"/>
+          <w:sz w:val="21"/>
+          <w:szCs w:val="21"/>
+        </w:rPr>
+        <w:t xml:space="preserve">Optymalizacja na podstawie wyników</w:t>
+      </w:r>
+      <w:r>
+        <w:rPr>
+          <w:rFonts w:ascii="Calibri" w:cs="Calibri" w:eastAsia="Calibri" w:hAnsi="Calibri"/>
+          <w:color w:val="333333"/>
+          <w:sz w:val="21"/>
+          <w:szCs w:val="21"/>
+        </w:rPr>
+        <w:t xml:space="preserve"> – budżet kierowany tam, gdzie przynosi leady</w:t>
       </w:r>
     </w:p>
     <w:p>

</xml_diff>

<commit_message>
Zostaw w materiałach sprzedażowych tylko karty lokali
Co-Authored-By: Claude Opus 5.5 <noreply@anthropic.com>
Claude-Session: https://claude.ai/code/session_019y51daMZffDwdD1p2RgJhu
</commit_message>
<xml_diff>
--- a/Kaszubska_Osada_podsumowanie_uslug.docx
+++ b/Kaszubska_Osada_podsumowanie_uslug.docx
@@ -631,66 +631,6 @@
           <w:szCs w:val="21"/>
         </w:rPr>
         <w:t xml:space="preserve"> – autorski projekt karty dla każdego domu, do pobrania ze strony</w:t>
-      </w:r>
-    </w:p>
-    <w:p>
-      <w:pPr>
-        <w:pStyle w:val="ListParagraph"/>
-        <w:numPr>
-          <w:ilvl w:val="0"/>
-          <w:numId w:val="2"/>
-        </w:numPr>
-        <w:spacing w:after="70"/>
-      </w:pPr>
-      <w:r>
-        <w:rPr>
-          <w:rFonts w:ascii="Calibri" w:cs="Calibri" w:eastAsia="Calibri" w:hAnsi="Calibri"/>
-          <w:b/>
-          <w:bCs/>
-          <w:color w:val="1A3A2A"/>
-          <w:sz w:val="21"/>
-          <w:szCs w:val="21"/>
-        </w:rPr>
-        <w:t xml:space="preserve">Standard wykończenia</w:t>
-      </w:r>
-      <w:r>
-        <w:rPr>
-          <w:rFonts w:ascii="Calibri" w:cs="Calibri" w:eastAsia="Calibri" w:hAnsi="Calibri"/>
-          <w:color w:val="333333"/>
-          <w:sz w:val="21"/>
-          <w:szCs w:val="21"/>
-        </w:rPr>
-        <w:t xml:space="preserve"> – czytelna prezentacja na stronie i do pobrania</w:t>
-      </w:r>
-    </w:p>
-    <w:p>
-      <w:pPr>
-        <w:pStyle w:val="ListParagraph"/>
-        <w:numPr>
-          <w:ilvl w:val="0"/>
-          <w:numId w:val="2"/>
-        </w:numPr>
-        <w:spacing w:after="70"/>
-      </w:pPr>
-      <w:r>
-        <w:rPr>
-          <w:rFonts w:ascii="Calibri" w:cs="Calibri" w:eastAsia="Calibri" w:hAnsi="Calibri"/>
-          <w:b/>
-          <w:bCs/>
-          <w:color w:val="1A3A2A"/>
-          <w:sz w:val="21"/>
-          <w:szCs w:val="21"/>
-        </w:rPr>
-        <w:t xml:space="preserve">Obróbka zdjęć i wizualizacji</w:t>
-      </w:r>
-      <w:r>
-        <w:rPr>
-          <w:rFonts w:ascii="Calibri" w:cs="Calibri" w:eastAsia="Calibri" w:hAnsi="Calibri"/>
-          <w:color w:val="333333"/>
-          <w:sz w:val="21"/>
-          <w:szCs w:val="21"/>
-        </w:rPr>
-        <w:t xml:space="preserve"> – retusz, kadrowanie i optymalizacja pod szybkie ładowanie</w:t>
       </w:r>
     </w:p>
     <w:p>

</xml_diff>